<commit_message>
docs(dossier-projet): update for WordPress + MariaDB
</commit_message>
<xml_diff>
--- a/documentation/Dossier_Projet_iac-infra_ASD.docx
+++ b/documentation/Dossier_Projet_iac-infra_ASD.docx
@@ -1717,7 +1717,7 @@
           <w:sz w:val="20"/>
           <w:szCs w:val="20"/>
         </w:rPr>
-        <w:t xml:space="preserve">BF02 - Configurer automatiquement le serveur (Nginx, securite, monitoring) via Ansible</w:t>
+        <w:t xml:space="preserve">BF02 - Configurer automatiquement le serveur (WordPress, securite, monitoring) via Ansible</w:t>
       </w:r>
     </w:p>
     <w:p>
@@ -1755,7 +1755,7 @@
           <w:sz w:val="20"/>
           <w:szCs w:val="20"/>
         </w:rPr>
-        <w:t xml:space="preserve">BF04 - Conteneuriser une application web avec sa base de donnees PostgreSQL</w:t>
+        <w:t xml:space="preserve">BF04 - Conteneuriser une application web WordPress avec sa base de donnees MariaDB</w:t>
       </w:r>
     </w:p>
     <w:p>
@@ -2769,7 +2769,7 @@
                 <w:sz w:val="20"/>
                 <w:szCs w:val="20"/>
               </w:rPr>
-              <w:t xml:space="preserve">  Ansible (3 roles) --&gt; Nginx + Security + Monitoring</w:t>
+              <w:t xml:space="preserve">  Ansible (4 roles) --&gt; Base + Security + Monitoring + WebApp (WordPress)</w:t>
             </w:r>
           </w:p>
           <w:p>
@@ -2826,7 +2826,7 @@
                 <w:sz w:val="20"/>
                 <w:szCs w:val="20"/>
               </w:rPr>
-              <w:t xml:space="preserve">  Docker Compose --&gt; web (Nginx) + db (PostgreSQL) + monitoring stack</w:t>
+              <w:t xml:space="preserve">  Docker Compose --&gt; web (WordPress) + db (MariaDB) + monitoring stack</w:t>
             </w:r>
           </w:p>
           <w:p>
@@ -2902,7 +2902,7 @@
                 <w:sz w:val="20"/>
                 <w:szCs w:val="20"/>
               </w:rPr>
-              <w:t xml:space="preserve">  Prometheus (9090) --&gt; scrape node-exporter + Nginx + alertmanager</w:t>
+              <w:t xml:space="preserve">  Prometheus (9090) --&gt; scrape node-exporter + mysqld-exporter + alertmanager</w:t>
             </w:r>
           </w:p>
           <w:p>
@@ -4155,7 +4155,7 @@
           <w:sz w:val="20"/>
           <w:szCs w:val="20"/>
         </w:rPr>
-        <w:t xml:space="preserve">Role common : installation Nginx, configuration vhosts, activation du service</w:t>
+        <w:t xml:space="preserve">Role common : installation des paquets de base. Role webapp : deploiement de WordPress + MariaDB via Docker Compose</w:t>
       </w:r>
     </w:p>
     <w:p>
@@ -4288,7 +4288,7 @@
           <w:sz w:val="20"/>
           <w:szCs w:val="20"/>
         </w:rPr>
-        <w:t xml:space="preserve">Le docker-compose.yml orchestre 6 services : web (Nginx custom), db (PostgreSQL 15 + init_db/schema.sql monte dans /docker-entrypoint-initdb.d), prometheus, grafana, node-exporter, alertmanager.</w:t>
+        <w:t xml:space="preserve">Le docker-compose.yml orchestre la stack applicative et de supervision : web (image WordPress custom durcie), db (MariaDB 11), mysqld-exporter, prometheus, grafana, node-exporter, alertmanager.</w:t>
       </w:r>
     </w:p>
     <w:p>
@@ -4342,7 +4342,7 @@
           <w:sz w:val="20"/>
           <w:szCs w:val="20"/>
         </w:rPr>
-        <w:t xml:space="preserve">postgres-deployment.yml : Deployment + PVC 1Gi (ReadWriteOnce) + Secret (base64)</w:t>
+        <w:t xml:space="preserve">mariadb.yml : Deployment + PVC 1Gi + Secret (base64). wordpress.yml : Deployment 2 replicas + PVC 2Gi (wp-content)</w:t>
       </w:r>
     </w:p>
     <w:p>
@@ -4906,7 +4906,7 @@
           <w:sz w:val="20"/>
           <w:szCs w:val="20"/>
         </w:rPr>
-        <w:t xml:space="preserve">prometheus.yml definit 4 scrape configs : prometheus (9090), node-exporter (9100), Nginx (80/metrics), alertmanager (9093). Les regles d'alerte (rules/alerts.yml) incluent InstanceDown, HighMemory, NginxDown, DiskSpaceLow.</w:t>
+        <w:t xml:space="preserve">prometheus.yml definit 4 scrape configs : prometheus (9090), node-exporter (9100), mysqld-exporter (9104), alertmanager (9093). Les regles d'alerte (alerts.yml) incluent HighCPUUsage, HighMemoryUsage, NginxDown.</w:t>
       </w:r>
     </w:p>
     <w:p>
@@ -4992,7 +4992,7 @@
           <w:sz w:val="22"/>
           <w:szCs w:val="22"/>
         </w:rPr>
-        <w:t xml:space="preserve">PostgreSQL - Initialisation automatique</w:t>
+        <w:t xml:space="preserve">WordPress + MariaDB - Base de donnees</w:t>
       </w:r>
     </w:p>
     <w:p>
@@ -5011,7 +5011,7 @@
           <w:sz w:val="20"/>
           <w:szCs w:val="20"/>
         </w:rPr>
-        <w:t xml:space="preserve">init_db/schema.sql cree la table public.utilisateurs et insere des donnees de test avec ON CONFLICT DO NOTHING (idempotent). Monte dans /docker-entrypoint-initdb.d:ro - execute automatiquement au premier demarrage.</w:t>
+        <w:t xml:space="preserve">MariaDB cree automatiquement la base wordpress au premier demarrage (variables MARIADB_*). WordPress genere ensuite son propre schema (wp_users, wp_posts, wp_options...) lors de l'installation. Les donnees persistent dans un volume Docker dedie (mariadb_data).</w:t>
       </w:r>
     </w:p>
     <w:p>
@@ -5244,7 +5244,7 @@
                 <w:sz w:val="18"/>
                 <w:szCs w:val="18"/>
               </w:rPr>
-              <w:t xml:space="preserve">VM Nginx</w:t>
+              <w:t xml:space="preserve">VM WordPress</w:t>
             </w:r>
           </w:p>
         </w:tc>
@@ -5318,7 +5318,7 @@
                 <w:sz w:val="18"/>
                 <w:szCs w:val="18"/>
               </w:rPr>
-              <w:t xml:space="preserve">200 OK - page Nginx</w:t>
+              <w:t xml:space="preserve">200 OK - WordPress</w:t>
             </w:r>
           </w:p>
         </w:tc>
@@ -5922,7 +5922,7 @@
                 <w:sz w:val="18"/>
                 <w:szCs w:val="18"/>
               </w:rPr>
-              <w:t xml:space="preserve">PostgreSQL init</w:t>
+              <w:t xml:space="preserve">MariaDB / WordPress</w:t>
             </w:r>
           </w:p>
         </w:tc>
@@ -5959,7 +5959,7 @@
                 <w:sz w:val="18"/>
                 <w:szCs w:val="18"/>
               </w:rPr>
-              <w:t xml:space="preserve">docker compose exec db psql -c 'SELECT * FROM utilisateurs'</w:t>
+              <w:t xml:space="preserve">docker compose exec db mariadb -uroot -p... -e 'SHOW TABLES' wordpress</w:t>
             </w:r>
           </w:p>
         </w:tc>
@@ -6148,7 +6148,7 @@
                 <w:sz w:val="18"/>
                 <w:szCs w:val="18"/>
               </w:rPr>
-              <w:t xml:space="preserve">K8s Nginx</w:t>
+              <w:t xml:space="preserve">K8s WordPress</w:t>
             </w:r>
           </w:p>
         </w:tc>
@@ -6261,7 +6261,7 @@
                 <w:sz w:val="18"/>
                 <w:szCs w:val="18"/>
               </w:rPr>
-              <w:t xml:space="preserve">K8s PostgreSQL</w:t>
+              <w:t xml:space="preserve">K8s MariaDB</w:t>
             </w:r>
           </w:p>
         </w:tc>
@@ -6298,7 +6298,7 @@
                 <w:sz w:val="18"/>
                 <w:szCs w:val="18"/>
               </w:rPr>
-              <w:t xml:space="preserve">kubectl exec -it postgres-xxx -- psql -c '\l'</w:t>
+              <w:t xml:space="preserve">kubectl exec -it mariadb-xxx -- mariadb -e 'SHOW DATABASES'</w:t>
             </w:r>
           </w:p>
         </w:tc>
@@ -7249,7 +7249,7 @@
                 <w:sz w:val="18"/>
                 <w:szCs w:val="18"/>
               </w:rPr>
-              <w:t xml:space="preserve">init_db/ absent</w:t>
+              <w:t xml:space="preserve">Application Nginx vide (boite vide)</w:t>
             </w:r>
           </w:p>
         </w:tc>
@@ -7323,7 +7323,7 @@
                 <w:sz w:val="18"/>
                 <w:szCs w:val="18"/>
               </w:rPr>
-              <w:t xml:space="preserve">Creation init_db/schema.sql + mount docker-compose</w:t>
+              <w:t xml:space="preserve">Migration vers WordPress + MariaDB (image custom, K8s HA)</w:t>
             </w:r>
           </w:p>
         </w:tc>
@@ -8397,7 +8397,7 @@
           <w:sz w:val="20"/>
           <w:szCs w:val="20"/>
         </w:rPr>
-        <w:t xml:space="preserve">Implémenter des dashboards Grafana supplementaires (PostgreSQL, Docker containers)</w:t>
+        <w:t xml:space="preserve">Implementer des dashboards Grafana supplementaires (MariaDB, conteneurs Docker)</w:t>
       </w:r>
     </w:p>
     <w:p>

</xml_diff>

<commit_message>
docs(dossier-projet): fix stale Nginx/PostgreSQL references to WordPress/MariaDB
Align Dossier Projet with current stack:
- nginx-deployment.yml -> wordpress.yml
- nginx-hpa.yml -> hpa.yml
- alert NginxDown -> InstanceDown (matches monitoring/alerts.yml)
- systemctl status nginx -> systemctl status docker
- kubectl pods nginx-xxx -> wordpress-xxx
- hpa nginx-hpa -> wordpress-hpa
- Docker Hub pilot-loicrich/iac-nginx -> lnanzotonlieu/iac-wordpress

Co-Authored-By: Claude Opus 4.8 <noreply@anthropic.com>
</commit_message>
<xml_diff>
--- a/documentation/Dossier_Projet_iac-infra_ASD.docx
+++ b/documentation/Dossier_Projet_iac-infra_ASD.docx
@@ -4323,7 +4323,7 @@
           <w:sz w:val="20"/>
           <w:szCs w:val="20"/>
         </w:rPr>
-        <w:t xml:space="preserve">nginx-deployment.yml : Deployment 2 replicas + Service NodePort (port 30080)</w:t>
+        <w:t xml:space="preserve">wordpress.yml : Deployment 2 replicas + Service NodePort (port 30080)</w:t>
       </w:r>
     </w:p>
     <w:p>
@@ -4361,7 +4361,7 @@
           <w:sz w:val="20"/>
           <w:szCs w:val="20"/>
         </w:rPr>
-        <w:t xml:space="preserve">nginx-hpa.yml : HorizontalPodAutoscaler (2-10 replicas, CPU threshold 50%)</w:t>
+        <w:t xml:space="preserve">hpa.yml : HorizontalPodAutoscaler (2-10 replicas, CPU threshold 50%)</w:t>
       </w:r>
     </w:p>
     <w:p>
@@ -4906,7 +4906,7 @@
           <w:sz w:val="20"/>
           <w:szCs w:val="20"/>
         </w:rPr>
-        <w:t xml:space="preserve">prometheus.yml definit 4 scrape configs : prometheus (9090), node-exporter (9100), mysqld-exporter (9104), alertmanager (9093). Les regles d'alerte (alerts.yml) incluent HighCPUUsage, HighMemoryUsage, NginxDown.</w:t>
+        <w:t xml:space="preserve">prometheus.yml definit 4 scrape configs : prometheus (9090), node-exporter (9100), mysqld-exporter (9104), alertmanager (9093). Les regles d'alerte (alerts.yml) incluent HighCPUUsage, HighMemoryUsage, InstanceDown.</w:t>
       </w:r>
     </w:p>
     <w:p>
@@ -5394,7 +5394,7 @@
                 <w:sz w:val="18"/>
                 <w:szCs w:val="18"/>
               </w:rPr>
-              <w:t xml:space="preserve">vagrant ssh -c 'systemctl status nginx'</w:t>
+              <w:t xml:space="preserve">vagrant ssh -c 'systemctl status docker'</w:t>
             </w:r>
           </w:p>
         </w:tc>
@@ -6222,7 +6222,7 @@
                 <w:sz w:val="18"/>
                 <w:szCs w:val="18"/>
               </w:rPr>
-              <w:t xml:space="preserve">nginx-xxx Running</w:t>
+              <w:t xml:space="preserve">wordpress-xxx Running</w:t>
             </w:r>
           </w:p>
         </w:tc>
@@ -6448,7 +6448,7 @@
                 <w:sz w:val="18"/>
                 <w:szCs w:val="18"/>
               </w:rPr>
-              <w:t xml:space="preserve">nginx-hpa TARGETS OK</w:t>
+              <w:t xml:space="preserve">wordpress-hpa TARGETS OK</w:t>
             </w:r>
           </w:p>
         </w:tc>
@@ -8917,7 +8917,7 @@
           <w:sz w:val="20"/>
           <w:szCs w:val="20"/>
         </w:rPr>
-        <w:t xml:space="preserve">Image Docker Hub : https://hub.docker.com/r/pilot-loicrich/iac-nginx</w:t>
+        <w:t xml:space="preserve">Image Docker Hub : https://hub.docker.com/r/lnanzotonlieu/iac-wordpress</w:t>
       </w:r>
     </w:p>
     <w:sectPr>

</xml_diff>